<commit_message>
docs(whitepaper): remove four overclaims carried over into v1.1
The v1.1 whitepaper still contained four statements from v1.0 that
contradict its own §5.4 or the pending EU AI Act / conformity status:

- disclaimer box: "i parametri non sono calibrati empiricamente" ->
  weights calibrated and validated on the 53-source holdout, band
  thresholds not
- Conclusions: "production-ready" removed
- regulatory section, GDPR: "garantiscono la piena conformità" ->
  endpoints support the rights; conformity is the adopter's to verify
- Executive Summary: "GDPR-compliant" (text and key-figures table) ->
  "documentati", matching the README badge

Text-only edits in word/document.xml; structure and schema validity
unchanged (548 paragraphs, 19 tables, OOXML validation passes).

Co-Authored-By: Claude Opus 5.5 <noreply@anthropic.com>
Claude-Session: https://claude.ai/code/session_01LEyFMxUWC5qKbQWdvH39vR
</commit_message>
<xml_diff>
--- a/docs/CATS_WhitePaper_Tecnico_v1.1.docx
+++ b/docs/CATS_WhitePaper_Tecnico_v1.1.docx
@@ -383,7 +383,7 @@
           <w:sz w:val="22"/>
           <w:szCs w:val="22"/>
         </w:rPr>
-        <w:t>Il sistema implementa un pipeline basato su FastAPI e Python 3.11, con quattro segnali analitici (coerenza, volatilità, silenzio, gaming) più una penalità asimmetrica di domain-provenance, audit cifrato AES-256-GCM, rate limiting distribuito via Redis e un’API GDPR-compliant con endpoint dedicati agli Artt. 13–22 del Regolamento (UE) 2016/679. I pesi di aggregazione sono calibrati empiricamente e validati su un holdout temporale (§5.4). La classificazione di CATS ai sensi dell’EU AI Act non è determinata in questo documento: è una valutazione che dipende dall’uso concreto e richiede consulenza legale (§7.3).</w:t>
+        <w:t>Il sistema implementa un pipeline basato su FastAPI e Python 3.11, con quattro segnali analitici (coerenza, volatilità, silenzio, gaming) più una penalità asimmetrica di domain-provenance, audit cifrato AES-256-GCM, rate limiting distribuito via Redis e un’API con endpoint dedicati agli Artt. 13–22 del Regolamento (UE) 2016/679. I pesi di aggregazione sono calibrati empiricamente e validati su un holdout temporale (§5.4). La classificazione di CATS ai sensi dell’EU AI Act non è determinata in questo documento: è una valutazione che dipende dall’uso concreto e richiede consulenza legale (§7.3).</w:t>
       </w:r>
       <w:r>
         <w:rPr>
@@ -650,7 +650,7 @@
                 <w:sz w:val="18"/>
                 <w:szCs w:val="18"/>
               </w:rPr>
-              <w:t xml:space="preserve">Art. 13–22 compliant</w:t>
+              <w:t>Art. 13–22 documentati</w:t>
             </w:r>
             <w:r/>
             <w:r/>
@@ -14554,7 +14554,7 @@
           <w:sz w:val="22"/>
           <w:szCs w:val="22"/>
         </w:rPr>
-        <w:t>CATS v1.1 fornisce un sistema funzionale e production-ready per la valutazione automatizzata dell’affidabilità delle fonti OSINT, con un approccio trasparente, esplicabile e allineato alle principali normative europee (GDPR; per l’EU AI Act vedi §7.3).</w:t>
+        <w:t>CATS v1.1 fornisce un sistema funzionale per la valutazione automatizzata dell’affidabilità delle fonti OSINT, validato su un holdout temporale di 53 fonti (§5.4), con un approccio trasparente ed esplicabile ed endpoint dedicati ai diritti previsti dal GDPR (per l’EU AI Act vedi §7.3).</w:t>
       </w:r>
       <w:r/>
     </w:p>
@@ -14691,7 +14691,7 @@
                 <w:sz w:val="20"/>
                 <w:szCs w:val="20"/>
               </w:rPr>
-              <w:t xml:space="preserve">unteggi CATS sono classificazioni ordinali dei pattern di affidabilità delle fonti, non probabilità assolute. L’accuratezza NLP è stimata al 55–62% (v1.0); i parametri non sono calibrati empiricamente. Non adatti come unico criterio per decisioni autonome.</w:t>
+              <w:t>unteggi CATS sono classificazioni ordinali dei pattern di affidabilità delle fonti, non probabilità assolute. L’accuratezza NLP del backend predefinito è stimata al 55–62%; i pesi di aggregazione sono calibrati e validati su un holdout temporale di 53 fonti (§5.4), le soglie di banda no. Non adatti come unico criterio per decisioni autonome.</w:t>
             </w:r>
             <w:r/>
             <w:r/>
@@ -17064,7 +17064,7 @@
           <w:sz w:val="22"/>
           <w:u w:val="none"/>
         </w:rPr>
-        <w:t xml:space="preserve"> Il sistema rispetta il principio di "Privacy by Design" (Art. 25), assicurando che nessun dato personale grezzo venga memorizzato in chiaro. Gli endpoint per la trasparenza (Artt. 13-14) e la contestazione delle decisioni automatizzate (Art. 22) garantisc</w:t>
+        <w:t xml:space="preserve"> Il sistema rispetta il principio di "Privacy by Design" (Art. 25), assicurando che nessun dato personale grezzo venga memorizzato in chiaro. Gli endpoint per la trasparenza (Artt. 13-14) e la contestazione delle decisioni automatizzate (Art. 22) supportano l’esercizio di questi diritti; la verifica di conformità resta in capo a ciascuna organizzazione che adotta il sistema.</w:t>
       </w:r>
       <w:r>
         <w:rPr>
@@ -17073,7 +17073,6 @@
           <w:sz w:val="22"/>
           <w:u w:val="none"/>
         </w:rPr>
-        <w:t xml:space="preserve">ono la piena conformità per le organizzazioni che operano sul mercato UE.</w:t>
       </w:r>
       <w:r>
         <w:rPr>

</xml_diff>